<commit_message>
fix: nomor & huruf di notulen kini daftar Word sungguhan (bukan teks biasa)
Sebelumnya "1." dan "a./b./c." ditulis sebagai teks, sub-poin digabung dalam satu paragraf
sehingga baris yang membungkus tidak punya indentasi gantung.

- Template: daftar bertingkat Word - level 1 bernomor otomatis (tebal), level 2 berhuruf
  otomatis yang mulai ulang di tiap poin utama; tiap sub-poin jadi paragraf sendiri lewat
  loop {#subpoints}
- Schema: kirim `subpoints` sebagai daftar; `subpointsText` dipertahankan untuk template
  kustom lama
- Generator template diperbarui dengan format yang sama untuk instalasi baru

Co-Authored-By: Claude Sonnet 5.5 <noreply@anthropic.com>
</commit_message>
<xml_diff>
--- a/Template/mom_meeting_minutes_template.docx
+++ b/Template/mom_meeting_minutes_template.docx
@@ -299,29 +299,65 @@
     </w:p>
     <w:p>
       <w:pPr>
-        <w:spacing w:before="120"/>
-      </w:pPr>
-      <w:r>
+        <w:keepNext/>
+        <w:numPr>
+          <w:ilvl w:val="0"/>
+          <w:numId w:val="90"/>
+        </w:numPr>
+        <w:spacing w:before="120" w:after="60"/>
         <w:rPr>
           <w:b/>
           <w:bCs/>
           <w:sz w:val="22"/>
           <w:szCs w:val="22"/>
         </w:rPr>
-        <w:t xml:space="preserve">{no}. {point}</w:t>
-      </w:r>
-    </w:p>
-    <w:p>
-      <w:pPr>
-        <w:spacing w:after="160"/>
-        <w:ind w:left="400"/>
-      </w:pPr>
-      <w:r>
-        <w:rPr>
+      </w:pPr>
+      <w:r>
+        <w:rPr>
+          <w:b/>
+          <w:bCs/>
           <w:sz w:val="22"/>
           <w:szCs w:val="22"/>
         </w:rPr>
-        <w:t xml:space="preserve">{subpointsText}</w:t>
+        <w:t xml:space="preserve">{point}</w:t>
+      </w:r>
+    </w:p>
+    <w:p>
+      <w:r>
+        <w:rPr>
+          <w:sz w:val="2"/>
+          <w:szCs w:val="2"/>
+        </w:rPr>
+        <w:t xml:space="preserve">{#subpoints}</w:t>
+      </w:r>
+    </w:p>
+    <w:p>
+      <w:pPr>
+        <w:numPr>
+          <w:ilvl w:val="1"/>
+          <w:numId w:val="90"/>
+        </w:numPr>
+        <w:spacing w:after="60"/>
+        <w:rPr>
+          <w:sz w:val="22"/>
+          <w:szCs w:val="22"/>
+        </w:rPr>
+      </w:pPr>
+      <w:r>
+        <w:rPr>
+          <w:sz w:val="22"/>
+          <w:szCs w:val="22"/>
+        </w:rPr>
+        <w:t xml:space="preserve">{text}</w:t>
+      </w:r>
+    </w:p>
+    <w:p>
+      <w:r>
+        <w:rPr>
+          <w:sz w:val="2"/>
+          <w:szCs w:val="2"/>
+        </w:rPr>
+        <w:t xml:space="preserve">{/subpoints}</w:t>
       </w:r>
     </w:p>
     <w:p>
@@ -787,11 +823,39 @@
       </w:pPr>
     </w:lvl>
   </w:abstractNum>
+  <w:abstractNum w:abstractNumId="90">
+    <w:multiLevelType w:val="multilevel"/>
+    <w:lvl w:ilvl="0">
+      <w:start w:val="1"/>
+      <w:numFmt w:val="decimal"/>
+      <w:lvlText w:val="%1."/>
+      <w:lvlJc w:val="left"/>
+      <w:pPr>
+        <w:ind w:left="426" w:hanging="426"/>
+      </w:pPr>
+      <w:rPr>
+        <w:b/>
+        <w:bCs/>
+      </w:rPr>
+    </w:lvl>
+    <w:lvl w:ilvl="1">
+      <w:start w:val="1"/>
+      <w:numFmt w:val="lowerLetter"/>
+      <w:lvlText w:val="%2."/>
+      <w:lvlJc w:val="left"/>
+      <w:pPr>
+        <w:ind w:left="852" w:hanging="426"/>
+      </w:pPr>
+    </w:lvl>
+  </w:abstractNum>
   <w:num w:numId="1">
     <w:abstractNumId w:val="1"/>
     <w:lvlOverride w:ilvl="0">
       <w:startOverride w:val="1"/>
     </w:lvlOverride>
+  </w:num>
+  <w:num w:numId="90">
+    <w:abstractNumId w:val="90"/>
   </w:num>
 </w:numbering>
 </file>

</xml_diff>